<commit_message>
Lock in MC platform + automation work (per Jon)
Commits the substantive work sitting uncommitted on erp-phase0:
- New Mission Control pages (CRM/contacts, gov-readiness, opportunities,
  process-library, ctd-dd) and edits to index/program/decisions/help + server.js
- ~96 automation scripts (funds tracker, dedup, schedulers, watchers, etc.)
- config + data/state edits (relationships, mission data, capability matrix)
- workspace edits (USER, HEARTBEAT, TOOLS) and tracked-file cleanups/deletions

Deliberately EXCLUDED from this commit (artifact sprawl, not code):
~2,058 files in drafts/, plus loose .docx/.pdf/.pptx/.png/.xlsx/.mp4/.zip
artifacts, dedup snapshots, and log files. These need a .gitignore, not a commit.

Co-Authored-By: Claude Opus 4.8 <noreply@anthropic.com>
</commit_message>
<xml_diff>
--- a/assets/EXOS Letterhead Greenville TX
 address (PRIMARY).docx
+++ b/assets/EXOS Letterhead Greenville TX
 address (PRIMARY).docx
@@ -4,8 +4,12 @@
   <w:body>
     <w:p/>
     <w:sectPr>
-      <w:headerReference w:type="default" r:id="rId11"/>
-      <w:footerReference w:type="default" r:id="rId12"/>
+      <w:headerReference w:type="even" r:id="rId11"/>
+      <w:headerReference w:type="default" r:id="rId12"/>
+      <w:footerReference w:type="even" r:id="rId13"/>
+      <w:footerReference w:type="default" r:id="rId14"/>
+      <w:headerReference w:type="first" r:id="rId15"/>
+      <w:footerReference w:type="first" r:id="rId16"/>
       <w:pgSz w:w="12240" w:h="15840"/>
       <w:pgMar w:top="1584" w:right="576" w:bottom="1152" w:left="1440" w:header="504" w:footer="504" w:gutter="0"/>
       <w:cols w:space="720"/>
@@ -40,21 +44,42 @@
     <w:pPr>
       <w:pStyle w:val="Footer"/>
     </w:pPr>
+  </w:p>
+</w:ftr>
+</file>
+
+<file path=word/footer2.xml><?xml version="1.0" encoding="utf-8"?>
+<w:ftr xmlns:wpc="http://schemas.microsoft.com/office/word/2010/wordprocessingCanvas" xmlns:cx="http://schemas.microsoft.com/office/drawing/2014/chartex" xmlns:cx1="http://schemas.microsoft.com/office/drawing/2015/9/8/chartex" xmlns:cx2="http://schemas.microsoft.com/office/drawing/2015/10/21/chartex" xmlns:cx3="http://schemas.microsoft.com/office/drawing/2016/5/9/chartex" xmlns:cx4="http://schemas.microsoft.com/office/drawing/2016/5/10/chartex" xmlns:cx5="http://schemas.microsoft.com/office/drawing/2016/5/11/chartex" xmlns:cx6="http://schemas.microsoft.com/office/drawing/2016/5/12/chartex" xmlns:cx7="http://schemas.microsoft.com/office/drawing/2016/5/13/chartex" xmlns:cx8="http://schemas.microsoft.com/office/drawing/2016/5/14/chartex" xmlns:mc="http://schemas.openxmlformats.org/markup-compatibility/2006" xmlns:aink="http://schemas.microsoft.com/office/drawing/2016/ink" xmlns:am3d="http://schemas.microsoft.com/office/drawing/2017/model3d" xmlns:o="urn:schemas-microsoft-com:office:office" xmlns:oel="http://schemas.microsoft.com/office/2019/extlst" xmlns:r="http://schemas.openxmlformats.org/officeDocument/2006/relationships" xmlns:m="http://schemas.openxmlformats.org/officeDocument/2006/math" xmlns:v="urn:schemas-microsoft-com:vml" xmlns:wp14="http://schemas.microsoft.com/office/word/2010/wordprocessingDrawing" xmlns:wp="http://schemas.openxmlformats.org/drawingml/2006/wordprocessingDrawing" xmlns:w10="urn:schemas-microsoft-com:office:word" xmlns:w="http://schemas.openxmlformats.org/wordprocessingml/2006/main" xmlns:w14="http://schemas.microsoft.com/office/word/2010/wordml" xmlns:w15="http://schemas.microsoft.com/office/word/2012/wordml" xmlns:w16cex="http://schemas.microsoft.com/office/word/2018/wordml/cex" xmlns:w16cid="http://schemas.microsoft.com/office/word/2016/wordml/cid" xmlns:w16="http://schemas.microsoft.com/office/word/2018/wordml" xmlns:w16du="http://schemas.microsoft.com/office/word/2023/wordml/word16du" xmlns:w16sdtdh="http://schemas.microsoft.com/office/word/2020/wordml/sdtdatahash" xmlns:w16sdtfl="http://schemas.microsoft.com/office/word/2024/wordml/sdtformatlock" xmlns:w16se="http://schemas.microsoft.com/office/word/2015/wordml/symex" xmlns:wpg="http://schemas.microsoft.com/office/word/2010/wordprocessingGroup" xmlns:wpi="http://schemas.microsoft.com/office/word/2010/wordprocessingInk" xmlns:wne="http://schemas.microsoft.com/office/word/2006/wordml" xmlns:wps="http://schemas.microsoft.com/office/word/2010/wordprocessingShape" mc:Ignorable="w14 w15 w16se w16cid w16 w16cex w16sdtdh w16sdtfl w16du wp14">
+  <w:p>
+    <w:pPr>
+      <w:pStyle w:val="Footer"/>
+    </w:pPr>
+  </w:p>
+  <w:p>
+    <w:pPr>
+      <w:pStyle w:val="Footer"/>
+    </w:pPr>
+  </w:p>
+  <w:p>
+    <w:pPr>
+      <w:pStyle w:val="Footer"/>
+      <w:jc w:val="center"/>
+    </w:pPr>
     <w:r>
       <w:rPr>
         <w:noProof/>
       </w:rPr>
       <w:drawing>
-        <wp:anchor distT="0" distB="0" distL="114300" distR="114300" simplePos="0" relativeHeight="251660288" behindDoc="1" locked="0" layoutInCell="1" allowOverlap="1" wp14:anchorId="77387259" wp14:editId="35CDD2D9">
+        <wp:anchor distT="0" distB="0" distL="114300" distR="114300" simplePos="0" relativeHeight="251660288" behindDoc="1" locked="0" layoutInCell="1" allowOverlap="1" wp14:anchorId="77387259" wp14:editId="5BC35EEC">
           <wp:simplePos x="0" y="0"/>
           <wp:positionH relativeFrom="page">
             <wp:align>right</wp:align>
           </wp:positionH>
           <wp:positionV relativeFrom="paragraph">
-            <wp:posOffset>-67945</wp:posOffset>
+            <wp:posOffset>63690</wp:posOffset>
           </wp:positionV>
-          <wp:extent cx="6492240" cy="1063625"/>
-          <wp:effectExtent l="0" t="0" r="0" b="3175"/>
+          <wp:extent cx="3425190" cy="561150"/>
+          <wp:effectExtent l="0" t="0" r="0" b="0"/>
           <wp:wrapNone/>
           <wp:docPr id="1274565867" name="Picture 1274565867" descr="A picture containing light&#10;&#10;Description automatically generated"/>
           <wp:cNvGraphicFramePr>
@@ -82,7 +107,7 @@
                 <pic:spPr>
                   <a:xfrm>
                     <a:off x="0" y="0"/>
-                    <a:ext cx="6492240" cy="1063625"/>
+                    <a:ext cx="3425190" cy="561150"/>
                   </a:xfrm>
                   <a:prstGeom prst="rect">
                     <a:avLst/>
@@ -101,15 +126,14 @@
       </w:drawing>
     </w:r>
   </w:p>
+</w:ftr>
+</file>
+
+<file path=word/footer3.xml><?xml version="1.0" encoding="utf-8"?>
+<w:ftr xmlns:wpc="http://schemas.microsoft.com/office/word/2010/wordprocessingCanvas" xmlns:cx="http://schemas.microsoft.com/office/drawing/2014/chartex" xmlns:cx1="http://schemas.microsoft.com/office/drawing/2015/9/8/chartex" xmlns:cx2="http://schemas.microsoft.com/office/drawing/2015/10/21/chartex" xmlns:cx3="http://schemas.microsoft.com/office/drawing/2016/5/9/chartex" xmlns:cx4="http://schemas.microsoft.com/office/drawing/2016/5/10/chartex" xmlns:cx5="http://schemas.microsoft.com/office/drawing/2016/5/11/chartex" xmlns:cx6="http://schemas.microsoft.com/office/drawing/2016/5/12/chartex" xmlns:cx7="http://schemas.microsoft.com/office/drawing/2016/5/13/chartex" xmlns:cx8="http://schemas.microsoft.com/office/drawing/2016/5/14/chartex" xmlns:mc="http://schemas.openxmlformats.org/markup-compatibility/2006" xmlns:aink="http://schemas.microsoft.com/office/drawing/2016/ink" xmlns:am3d="http://schemas.microsoft.com/office/drawing/2017/model3d" xmlns:o="urn:schemas-microsoft-com:office:office" xmlns:oel="http://schemas.microsoft.com/office/2019/extlst" xmlns:r="http://schemas.openxmlformats.org/officeDocument/2006/relationships" xmlns:m="http://schemas.openxmlformats.org/officeDocument/2006/math" xmlns:v="urn:schemas-microsoft-com:vml" xmlns:wp14="http://schemas.microsoft.com/office/word/2010/wordprocessingDrawing" xmlns:wp="http://schemas.openxmlformats.org/drawingml/2006/wordprocessingDrawing" xmlns:w10="urn:schemas-microsoft-com:office:word" xmlns:w="http://schemas.openxmlformats.org/wordprocessingml/2006/main" xmlns:w14="http://schemas.microsoft.com/office/word/2010/wordml" xmlns:w15="http://schemas.microsoft.com/office/word/2012/wordml" xmlns:w16cex="http://schemas.microsoft.com/office/word/2018/wordml/cex" xmlns:w16cid="http://schemas.microsoft.com/office/word/2016/wordml/cid" xmlns:w16="http://schemas.microsoft.com/office/word/2018/wordml" xmlns:w16du="http://schemas.microsoft.com/office/word/2023/wordml/word16du" xmlns:w16sdtdh="http://schemas.microsoft.com/office/word/2020/wordml/sdtdatahash" xmlns:w16sdtfl="http://schemas.microsoft.com/office/word/2024/wordml/sdtformatlock" xmlns:w16se="http://schemas.microsoft.com/office/word/2015/wordml/symex" xmlns:wpg="http://schemas.microsoft.com/office/word/2010/wordprocessingGroup" xmlns:wpi="http://schemas.microsoft.com/office/word/2010/wordprocessingInk" xmlns:wne="http://schemas.microsoft.com/office/word/2006/wordml" xmlns:wps="http://schemas.microsoft.com/office/word/2010/wordprocessingShape" mc:Ignorable="w14 w15 w16se w16cid w16 w16cex w16sdtdh w16sdtfl w16du wp14">
   <w:p>
     <w:pPr>
       <w:pStyle w:val="Footer"/>
-    </w:pPr>
-  </w:p>
-  <w:p>
-    <w:pPr>
-      <w:pStyle w:val="Footer"/>
-      <w:jc w:val="right"/>
     </w:pPr>
   </w:p>
 </w:ftr>
@@ -139,10 +163,21 @@
   <w:p>
     <w:pPr>
       <w:pStyle w:val="Header"/>
+    </w:pPr>
+  </w:p>
+</w:hdr>
+</file>
+
+<file path=word/header2.xml><?xml version="1.0" encoding="utf-8"?>
+<w:hdr xmlns:wpc="http://schemas.microsoft.com/office/word/2010/wordprocessingCanvas" xmlns:cx="http://schemas.microsoft.com/office/drawing/2014/chartex" xmlns:cx1="http://schemas.microsoft.com/office/drawing/2015/9/8/chartex" xmlns:cx2="http://schemas.microsoft.com/office/drawing/2015/10/21/chartex" xmlns:cx3="http://schemas.microsoft.com/office/drawing/2016/5/9/chartex" xmlns:cx4="http://schemas.microsoft.com/office/drawing/2016/5/10/chartex" xmlns:cx5="http://schemas.microsoft.com/office/drawing/2016/5/11/chartex" xmlns:cx6="http://schemas.microsoft.com/office/drawing/2016/5/12/chartex" xmlns:cx7="http://schemas.microsoft.com/office/drawing/2016/5/13/chartex" xmlns:cx8="http://schemas.microsoft.com/office/drawing/2016/5/14/chartex" xmlns:mc="http://schemas.openxmlformats.org/markup-compatibility/2006" xmlns:aink="http://schemas.microsoft.com/office/drawing/2016/ink" xmlns:am3d="http://schemas.microsoft.com/office/drawing/2017/model3d" xmlns:o="urn:schemas-microsoft-com:office:office" xmlns:oel="http://schemas.microsoft.com/office/2019/extlst" xmlns:r="http://schemas.openxmlformats.org/officeDocument/2006/relationships" xmlns:m="http://schemas.openxmlformats.org/officeDocument/2006/math" xmlns:v="urn:schemas-microsoft-com:vml" xmlns:wp14="http://schemas.microsoft.com/office/word/2010/wordprocessingDrawing" xmlns:wp="http://schemas.openxmlformats.org/drawingml/2006/wordprocessingDrawing" xmlns:w10="urn:schemas-microsoft-com:office:word" xmlns:w="http://schemas.openxmlformats.org/wordprocessingml/2006/main" xmlns:w14="http://schemas.microsoft.com/office/word/2010/wordml" xmlns:w15="http://schemas.microsoft.com/office/word/2012/wordml" xmlns:w16cex="http://schemas.microsoft.com/office/word/2018/wordml/cex" xmlns:w16cid="http://schemas.microsoft.com/office/word/2016/wordml/cid" xmlns:w16="http://schemas.microsoft.com/office/word/2018/wordml" xmlns:w16du="http://schemas.microsoft.com/office/word/2023/wordml/word16du" xmlns:w16sdtdh="http://schemas.microsoft.com/office/word/2020/wordml/sdtdatahash" xmlns:w16sdtfl="http://schemas.microsoft.com/office/word/2024/wordml/sdtformatlock" xmlns:w16se="http://schemas.microsoft.com/office/word/2015/wordml/symex" xmlns:wpg="http://schemas.microsoft.com/office/word/2010/wordprocessingGroup" xmlns:wpi="http://schemas.microsoft.com/office/word/2010/wordprocessingInk" xmlns:wne="http://schemas.microsoft.com/office/word/2006/wordml" xmlns:wps="http://schemas.microsoft.com/office/word/2010/wordprocessingShape" mc:Ignorable="w14 w15 w16se w16cid w16 w16cex w16sdtdh w16sdtfl w16du wp14">
+  <w:p>
+    <w:pPr>
+      <w:pStyle w:val="Header"/>
       <w:tabs>
+        <w:tab w:val="left" w:pos="2874"/>
         <w:tab w:val="right" w:pos="4680"/>
+        <w:tab w:val="right" w:pos="10224"/>
       </w:tabs>
-      <w:jc w:val="right"/>
       <w:rPr>
         <w:rFonts w:ascii="Tahoma" w:hAnsi="Tahoma" w:cs="Tahoma"/>
         <w:color w:val="808080" w:themeColor="background1" w:themeShade="80"/>
@@ -155,16 +190,16 @@
         <w:color w:val="808080" w:themeColor="background1" w:themeShade="80"/>
       </w:rPr>
       <w:drawing>
-        <wp:anchor distT="0" distB="0" distL="114300" distR="114300" simplePos="0" relativeHeight="251658240" behindDoc="1" locked="0" layoutInCell="1" allowOverlap="1" wp14:anchorId="24C38B4E" wp14:editId="0ADAEF45">
+        <wp:anchor distT="0" distB="0" distL="114300" distR="114300" simplePos="0" relativeHeight="251658240" behindDoc="1" locked="0" layoutInCell="1" allowOverlap="1" wp14:anchorId="24C38B4E" wp14:editId="74402038">
           <wp:simplePos x="0" y="0"/>
           <wp:positionH relativeFrom="column">
-            <wp:posOffset>-904240</wp:posOffset>
+            <wp:posOffset>-902970</wp:posOffset>
           </wp:positionH>
           <wp:positionV relativeFrom="paragraph">
-            <wp:posOffset>-467360</wp:posOffset>
+            <wp:posOffset>-468629</wp:posOffset>
           </wp:positionV>
-          <wp:extent cx="5943600" cy="1227455"/>
-          <wp:effectExtent l="0" t="0" r="0" b="4445"/>
+          <wp:extent cx="2880360" cy="594844"/>
+          <wp:effectExtent l="0" t="0" r="0" b="0"/>
           <wp:wrapNone/>
           <wp:docPr id="624236723" name="Picture 624236723" descr="A picture containing sitting&#10;&#10;Description automatically generated"/>
           <wp:cNvGraphicFramePr>
@@ -192,7 +227,7 @@
                 <pic:spPr>
                   <a:xfrm>
                     <a:off x="0" y="0"/>
-                    <a:ext cx="5943600" cy="1227455"/>
+                    <a:ext cx="2896129" cy="598101"/>
                   </a:xfrm>
                   <a:prstGeom prst="rect">
                     <a:avLst/>
@@ -215,56 +250,42 @@
         <w:rFonts w:ascii="Tahoma" w:hAnsi="Tahoma" w:cs="Tahoma"/>
         <w:color w:val="808080" w:themeColor="background1" w:themeShade="80"/>
       </w:rPr>
-      <w:t xml:space="preserve">299 </w:t>
+      <w:tab/>
     </w:r>
     <w:r>
       <w:rPr>
         <w:rFonts w:ascii="Tahoma" w:hAnsi="Tahoma" w:cs="Tahoma"/>
         <w:color w:val="808080" w:themeColor="background1" w:themeShade="80"/>
       </w:rPr>
-      <w:t>FM 1903 Greenville, TX. 75402</w:t>
+      <w:tab/>
+    </w:r>
+    <w:r>
+      <w:rPr>
+        <w:rFonts w:ascii="Tahoma" w:hAnsi="Tahoma" w:cs="Tahoma"/>
+        <w:color w:val="808080" w:themeColor="background1" w:themeShade="80"/>
+      </w:rPr>
+      <w:tab/>
     </w:r>
   </w:p>
   <w:p>
     <w:pPr>
       <w:pStyle w:val="Header"/>
-      <w:jc w:val="right"/>
+      <w:jc w:val="center"/>
       <w:rPr>
         <w:rFonts w:ascii="Tahoma" w:hAnsi="Tahoma" w:cs="Tahoma"/>
         <w:color w:val="808080" w:themeColor="background1" w:themeShade="80"/>
       </w:rPr>
     </w:pPr>
-    <w:r>
-      <w:rPr>
-        <w:rFonts w:ascii="Tahoma" w:hAnsi="Tahoma" w:cs="Tahoma"/>
-        <w:color w:val="808080" w:themeColor="background1" w:themeShade="80"/>
-      </w:rPr>
-      <w:t>www.</w:t>
-    </w:r>
-    <w:r>
-      <w:rPr>
-        <w:rFonts w:ascii="Tahoma" w:hAnsi="Tahoma" w:cs="Tahoma"/>
-        <w:color w:val="808080" w:themeColor="background1" w:themeShade="80"/>
-      </w:rPr>
-      <w:t>exosaero.com</w:t>
-    </w:r>
   </w:p>
+</w:hdr>
+</file>
+
+<file path=word/header3.xml><?xml version="1.0" encoding="utf-8"?>
+<w:hdr xmlns:wpc="http://schemas.microsoft.com/office/word/2010/wordprocessingCanvas" xmlns:cx="http://schemas.microsoft.com/office/drawing/2014/chartex" xmlns:cx1="http://schemas.microsoft.com/office/drawing/2015/9/8/chartex" xmlns:cx2="http://schemas.microsoft.com/office/drawing/2015/10/21/chartex" xmlns:cx3="http://schemas.microsoft.com/office/drawing/2016/5/9/chartex" xmlns:cx4="http://schemas.microsoft.com/office/drawing/2016/5/10/chartex" xmlns:cx5="http://schemas.microsoft.com/office/drawing/2016/5/11/chartex" xmlns:cx6="http://schemas.microsoft.com/office/drawing/2016/5/12/chartex" xmlns:cx7="http://schemas.microsoft.com/office/drawing/2016/5/13/chartex" xmlns:cx8="http://schemas.microsoft.com/office/drawing/2016/5/14/chartex" xmlns:mc="http://schemas.openxmlformats.org/markup-compatibility/2006" xmlns:aink="http://schemas.microsoft.com/office/drawing/2016/ink" xmlns:am3d="http://schemas.microsoft.com/office/drawing/2017/model3d" xmlns:o="urn:schemas-microsoft-com:office:office" xmlns:oel="http://schemas.microsoft.com/office/2019/extlst" xmlns:r="http://schemas.openxmlformats.org/officeDocument/2006/relationships" xmlns:m="http://schemas.openxmlformats.org/officeDocument/2006/math" xmlns:v="urn:schemas-microsoft-com:vml" xmlns:wp14="http://schemas.microsoft.com/office/word/2010/wordprocessingDrawing" xmlns:wp="http://schemas.openxmlformats.org/drawingml/2006/wordprocessingDrawing" xmlns:w10="urn:schemas-microsoft-com:office:word" xmlns:w="http://schemas.openxmlformats.org/wordprocessingml/2006/main" xmlns:w14="http://schemas.microsoft.com/office/word/2010/wordml" xmlns:w15="http://schemas.microsoft.com/office/word/2012/wordml" xmlns:w16cex="http://schemas.microsoft.com/office/word/2018/wordml/cex" xmlns:w16cid="http://schemas.microsoft.com/office/word/2016/wordml/cid" xmlns:w16="http://schemas.microsoft.com/office/word/2018/wordml" xmlns:w16du="http://schemas.microsoft.com/office/word/2023/wordml/word16du" xmlns:w16sdtdh="http://schemas.microsoft.com/office/word/2020/wordml/sdtdatahash" xmlns:w16sdtfl="http://schemas.microsoft.com/office/word/2024/wordml/sdtformatlock" xmlns:w16se="http://schemas.microsoft.com/office/word/2015/wordml/symex" xmlns:wpg="http://schemas.microsoft.com/office/word/2010/wordprocessingGroup" xmlns:wpi="http://schemas.microsoft.com/office/word/2010/wordprocessingInk" xmlns:wne="http://schemas.microsoft.com/office/word/2006/wordml" xmlns:wps="http://schemas.microsoft.com/office/word/2010/wordprocessingShape" mc:Ignorable="w14 w15 w16se w16cid w16 w16cex w16sdtdh w16sdtfl w16du wp14">
   <w:p>
     <w:pPr>
       <w:pStyle w:val="Header"/>
-      <w:jc w:val="right"/>
-      <w:rPr>
-        <w:rFonts w:ascii="Tahoma" w:hAnsi="Tahoma" w:cs="Tahoma"/>
-        <w:color w:val="808080" w:themeColor="background1" w:themeShade="80"/>
-      </w:rPr>
     </w:pPr>
-    <w:r>
-      <w:rPr>
-        <w:rFonts w:ascii="Tahoma" w:hAnsi="Tahoma" w:cs="Tahoma"/>
-        <w:color w:val="808080" w:themeColor="background1" w:themeShade="80"/>
-      </w:rPr>
-      <w:t>info@exosaero.com</w:t>
-    </w:r>
   </w:p>
 </w:hdr>
 </file>
@@ -2511,6 +2532,7 @@
   <w:style w:type="character" w:default="1" w:styleId="DefaultParagraphFont">
     <w:name w:val="Default Paragraph Font"/>
     <w:uiPriority w:val="1"/>
+    <w:semiHidden/>
     <w:unhideWhenUsed/>
   </w:style>
   <w:style w:type="table" w:default="1" w:styleId="TableNormal">
@@ -2603,7 +2625,6 @@
     <w:name w:val="Hyperlink"/>
     <w:basedOn w:val="DefaultParagraphFont"/>
     <w:uiPriority w:val="99"/>
-    <w:semiHidden/>
     <w:unhideWhenUsed/>
     <w:rsid w:val="001F4FE4"/>
     <w:rPr>
@@ -2634,6 +2655,16 @@
     <w:rPr>
       <w:b/>
       <w:bCs/>
+    </w:rPr>
+  </w:style>
+  <w:style w:type="character" w:styleId="UnresolvedMention">
+    <w:name w:val="Unresolved Mention"/>
+    <w:basedOn w:val="DefaultParagraphFont"/>
+    <w:uiPriority w:val="99"/>
+    <w:rsid w:val="00BD08F1"/>
+    <w:rPr>
+      <w:color w:val="605E5C"/>
+      <w:shd w:val="clear" w:color="auto" w:fill="E1DFDD"/>
     </w:rPr>
   </w:style>
 </w:styles>
@@ -2901,17 +2932,8 @@
 </file>
 
 <file path=customXml/item1.xml><?xml version="1.0" encoding="utf-8"?>
-<?mso-contentType ?>
-<FormTemplates xmlns="http://schemas.microsoft.com/sharepoint/v3/contenttype/forms">
-  <Display>DocumentLibraryForm</Display>
-  <Edit>DocumentLibraryForm</Edit>
-  <New>DocumentLibraryForm</New>
-</FormTemplates>
-</file>
-
-<file path=customXml/item2.xml><?xml version="1.0" encoding="utf-8"?>
-<ct:contentTypeSchema xmlns:ct="http://schemas.microsoft.com/office/2006/metadata/contentType" xmlns:ma="http://schemas.microsoft.com/office/2006/metadata/properties/metaAttributes" ct:_="" ma:_="" ma:contentTypeName="Document" ma:contentTypeID="0x010100B93BA222B086F94CB80A831AC79560FC" ma:contentTypeVersion="3" ma:contentTypeDescription="Create a new document." ma:contentTypeScope="" ma:versionID="c09950c259e5d87915ff701be3dfa6b1">
-  <xsd:schema xmlns:xsd="http://www.w3.org/2001/XMLSchema" xmlns:xs="http://www.w3.org/2001/XMLSchema" xmlns:p="http://schemas.microsoft.com/office/2006/metadata/properties" xmlns:ns2="e1558a10-1879-455f-b4fa-cfdedf85505e" targetNamespace="http://schemas.microsoft.com/office/2006/metadata/properties" ma:root="true" ma:fieldsID="c86ac627cc724fbab15d66a61f4e1c47" ns2:_="">
+<ct:contentTypeSchema xmlns:ct="http://schemas.microsoft.com/office/2006/metadata/contentType" xmlns:ma="http://schemas.microsoft.com/office/2006/metadata/properties/metaAttributes" ct:_="" ma:_="" ma:contentTypeName="Document" ma:contentTypeID="0x010100B93BA222B086F94CB80A831AC79560FC" ma:contentTypeVersion="3" ma:contentTypeDescription="Create a new document." ma:contentTypeScope="" ma:versionID="263de4db15e980f31c7a9f0e35eb1966">
+  <xsd:schema xmlns:xsd="http://www.w3.org/2001/XMLSchema" xmlns:xs="http://www.w3.org/2001/XMLSchema" xmlns:p="http://schemas.microsoft.com/office/2006/metadata/properties" xmlns:ns2="e1558a10-1879-455f-b4fa-cfdedf85505e" targetNamespace="http://schemas.microsoft.com/office/2006/metadata/properties" ma:root="true" ma:fieldsID="a929d5d4558f9b725dc8e1c5ef0a4e28" ns2:_="">
     <xsd:import namespace="e1558a10-1879-455f-b4fa-cfdedf85505e"/>
     <xsd:element name="properties">
       <xsd:complexType>
@@ -3047,26 +3069,27 @@
 </ct:contentTypeSchema>
 </file>
 
-<file path=customXml/item3.xml><?xml version="1.0" encoding="utf-8"?>
+<file path=customXml/item2.xml><?xml version="1.0" encoding="utf-8"?>
 <b:Sources xmlns:b="http://schemas.openxmlformats.org/officeDocument/2006/bibliography" xmlns="http://schemas.openxmlformats.org/officeDocument/2006/bibliography" SelectedStyle="/APASixthEditionOfficeOnline.xsl" StyleName="APA" Version="6"/>
 </file>
 
-<file path=customXml/item4.xml><?xml version="1.0" encoding="utf-8"?>
+<file path=customXml/item3.xml><?xml version="1.0" encoding="utf-8"?>
 <p:properties xmlns:p="http://schemas.microsoft.com/office/2006/metadata/properties" xmlns:xsi="http://www.w3.org/2001/XMLSchema-instance" xmlns:pc="http://schemas.microsoft.com/office/infopath/2007/PartnerControls">
   <documentManagement/>
 </p:properties>
 </file>
 
-<file path=customXml/itemProps1.xml><?xml version="1.0" encoding="utf-8"?>
-<ds:datastoreItem xmlns:ds="http://schemas.openxmlformats.org/officeDocument/2006/customXml" ds:itemID="{FB38FABD-2EB8-4C41-9791-D9CBE1419BD7}">
-  <ds:schemaRefs>
-    <ds:schemaRef ds:uri="http://schemas.microsoft.com/sharepoint/v3/contenttype/forms"/>
-  </ds:schemaRefs>
-</ds:datastoreItem>
+<file path=customXml/item4.xml><?xml version="1.0" encoding="utf-8"?>
+<?mso-contentType ?>
+<FormTemplates xmlns="http://schemas.microsoft.com/sharepoint/v3/contenttype/forms">
+  <Display>DocumentLibraryForm</Display>
+  <Edit>DocumentLibraryForm</Edit>
+  <New>DocumentLibraryForm</New>
+</FormTemplates>
 </file>
 
-<file path=customXml/itemProps2.xml><?xml version="1.0" encoding="utf-8"?>
-<ds:datastoreItem xmlns:ds="http://schemas.openxmlformats.org/officeDocument/2006/customXml" ds:itemID="{1B7CDA3B-F31A-4C14-B755-2A711437995C}">
+<file path=customXml/itemProps1.xml><?xml version="1.0" encoding="utf-8"?>
+<ds:datastoreItem xmlns:ds="http://schemas.openxmlformats.org/officeDocument/2006/customXml" ds:itemID="{0716354C-C618-42C0-890C-B79BDC3B5D78}">
   <ds:schemaRefs>
     <ds:schemaRef ds:uri="http://schemas.microsoft.com/office/2006/metadata/contentType"/>
     <ds:schemaRef ds:uri="http://schemas.microsoft.com/office/2006/metadata/properties/metaAttributes"/>
@@ -3083,7 +3106,7 @@
 </ds:datastoreItem>
 </file>
 
-<file path=customXml/itemProps3.xml><?xml version="1.0" encoding="utf-8"?>
+<file path=customXml/itemProps2.xml><?xml version="1.0" encoding="utf-8"?>
 <ds:datastoreItem xmlns:ds="http://schemas.openxmlformats.org/officeDocument/2006/customXml" ds:itemID="{1FE5F3B5-F71C-B54D-921B-25B8BE513B25}">
   <ds:schemaRefs>
     <ds:schemaRef ds:uri="http://schemas.openxmlformats.org/officeDocument/2006/bibliography"/>
@@ -3091,11 +3114,19 @@
 </ds:datastoreItem>
 </file>
 
-<file path=customXml/itemProps4.xml><?xml version="1.0" encoding="utf-8"?>
+<file path=customXml/itemProps3.xml><?xml version="1.0" encoding="utf-8"?>
 <ds:datastoreItem xmlns:ds="http://schemas.openxmlformats.org/officeDocument/2006/customXml" ds:itemID="{05C96887-8CC6-4F7F-BF09-CD8A4A0BF18C}">
   <ds:schemaRefs>
     <ds:schemaRef ds:uri="http://schemas.microsoft.com/office/2006/metadata/properties"/>
     <ds:schemaRef ds:uri="http://schemas.microsoft.com/office/infopath/2007/PartnerControls"/>
   </ds:schemaRefs>
 </ds:datastoreItem>
+</file>
+
+<file path=customXml/itemProps4.xml><?xml version="1.0" encoding="utf-8"?>
+<ds:datastoreItem xmlns:ds="http://schemas.openxmlformats.org/officeDocument/2006/customXml" ds:itemID="{FB38FABD-2EB8-4C41-9791-D9CBE1419BD7}">
+  <ds:schemaRefs>
+    <ds:schemaRef ds:uri="http://schemas.microsoft.com/sharepoint/v3/contenttype/forms"/>
+  </ds:schemaRefs>
+</ds:datastoreItem>
 </file>
</xml_diff>